<commit_message>
feat: v2.0 admin dashboard + backend updates complete
Admin Dashboard (new):
- Login/logout with role-based routing
- Dashboard with stats overview
- Route Management: CRUD + stops + map visualization
- Driver/Bus Management: CRUD with route assignments
- Student Management: bulk import + stop assignment
- Live Tracking: real-time bus positions via live_locations
- Reports: 8 report types with CSV/PDF export
- Complaints management
- Schedule builder

Backend Updates:
- app.js updated with new route registrations
- auth.js, buses.js, drivers.js, routes.js updated
- reports.js: all 8 report types + CSV/PDF export
- New: complaints.js, schedules.js, stats.js route handlers
- Fixed schema mismatches throughout
</commit_message>
<xml_diff>
--- a/documantation.docx
+++ b/documantation.docx
@@ -381,7 +381,7 @@
         <w:sdtPr>
           <w:id w:val="-1426565563"/>
           <w14:checkbox>
-            <w14:checked w14:val="0"/>
+            <w14:checked w14:val="1"/>
             <w14:checkedState w14:val="2612" w14:font="MS Gothic"/>
             <w14:uncheckedState w14:val="2610" w14:font="MS Gothic"/>
           </w14:checkbox>
@@ -391,7 +391,7 @@
             <w:rPr>
               <w:rFonts w:ascii="MS Gothic" w:eastAsia="MS Gothic" w:hAnsi="MS Gothic" w:hint="eastAsia"/>
             </w:rPr>
-            <w:t>☐</w:t>
+            <w:t>☒</w:t>
           </w:r>
         </w:sdtContent>
       </w:sdt>
@@ -407,7 +407,7 @@
         <w:sdtPr>
           <w:id w:val="-1266841199"/>
           <w14:checkbox>
-            <w14:checked w14:val="0"/>
+            <w14:checked w14:val="1"/>
             <w14:checkedState w14:val="2612" w14:font="MS Gothic"/>
             <w14:uncheckedState w14:val="2610" w14:font="MS Gothic"/>
           </w14:checkbox>
@@ -417,7 +417,7 @@
             <w:rPr>
               <w:rFonts w:ascii="MS Gothic" w:eastAsia="MS Gothic" w:hAnsi="MS Gothic" w:hint="eastAsia"/>
             </w:rPr>
-            <w:t>☐</w:t>
+            <w:t>☒</w:t>
           </w:r>
         </w:sdtContent>
       </w:sdt>
@@ -459,7 +459,7 @@
         <w:sdtPr>
           <w:id w:val="502097797"/>
           <w14:checkbox>
-            <w14:checked w14:val="0"/>
+            <w14:checked w14:val="1"/>
             <w14:checkedState w14:val="2612" w14:font="MS Gothic"/>
             <w14:uncheckedState w14:val="2610" w14:font="MS Gothic"/>
           </w14:checkbox>
@@ -469,7 +469,7 @@
             <w:rPr>
               <w:rFonts w:ascii="MS Gothic" w:eastAsia="MS Gothic" w:hAnsi="MS Gothic" w:hint="eastAsia"/>
             </w:rPr>
-            <w:t>☐</w:t>
+            <w:t>☒</w:t>
           </w:r>
         </w:sdtContent>
       </w:sdt>
@@ -485,7 +485,7 @@
         <w:sdtPr>
           <w:id w:val="1869253184"/>
           <w14:checkbox>
-            <w14:checked w14:val="0"/>
+            <w14:checked w14:val="1"/>
             <w14:checkedState w14:val="2612" w14:font="MS Gothic"/>
             <w14:uncheckedState w14:val="2610" w14:font="MS Gothic"/>
           </w14:checkbox>
@@ -495,7 +495,7 @@
             <w:rPr>
               <w:rFonts w:ascii="MS Gothic" w:eastAsia="MS Gothic" w:hAnsi="MS Gothic" w:hint="eastAsia"/>
             </w:rPr>
-            <w:t>☐</w:t>
+            <w:t>☒</w:t>
           </w:r>
         </w:sdtContent>
       </w:sdt>
@@ -523,7 +523,7 @@
         <w:sdtPr>
           <w:id w:val="589825608"/>
           <w14:checkbox>
-            <w14:checked w14:val="0"/>
+            <w14:checked w14:val="1"/>
             <w14:checkedState w14:val="2612" w14:font="MS Gothic"/>
             <w14:uncheckedState w14:val="2610" w14:font="MS Gothic"/>
           </w14:checkbox>
@@ -533,7 +533,7 @@
             <w:rPr>
               <w:rFonts w:ascii="MS Gothic" w:eastAsia="MS Gothic" w:hAnsi="MS Gothic" w:hint="eastAsia"/>
             </w:rPr>
-            <w:t>☐</w:t>
+            <w:t>☒</w:t>
           </w:r>
         </w:sdtContent>
       </w:sdt>
@@ -549,7 +549,7 @@
         <w:sdtPr>
           <w:id w:val="204453271"/>
           <w14:checkbox>
-            <w14:checked w14:val="0"/>
+            <w14:checked w14:val="1"/>
             <w14:checkedState w14:val="2612" w14:font="MS Gothic"/>
             <w14:uncheckedState w14:val="2610" w14:font="MS Gothic"/>
           </w14:checkbox>
@@ -559,7 +559,7 @@
             <w:rPr>
               <w:rFonts w:ascii="MS Gothic" w:eastAsia="MS Gothic" w:hAnsi="MS Gothic" w:hint="eastAsia"/>
             </w:rPr>
-            <w:t>☐</w:t>
+            <w:t>☒</w:t>
           </w:r>
         </w:sdtContent>
       </w:sdt>
@@ -575,7 +575,7 @@
         <w:sdtPr>
           <w:id w:val="1398711631"/>
           <w14:checkbox>
-            <w14:checked w14:val="0"/>
+            <w14:checked w14:val="1"/>
             <w14:checkedState w14:val="2612" w14:font="MS Gothic"/>
             <w14:uncheckedState w14:val="2610" w14:font="MS Gothic"/>
           </w14:checkbox>
@@ -585,7 +585,7 @@
             <w:rPr>
               <w:rFonts w:ascii="MS Gothic" w:eastAsia="MS Gothic" w:hAnsi="MS Gothic" w:hint="eastAsia"/>
             </w:rPr>
-            <w:t>☐</w:t>
+            <w:t>☒</w:t>
           </w:r>
         </w:sdtContent>
       </w:sdt>
@@ -601,7 +601,7 @@
         <w:sdtPr>
           <w:id w:val="-332225069"/>
           <w14:checkbox>
-            <w14:checked w14:val="0"/>
+            <w14:checked w14:val="1"/>
             <w14:checkedState w14:val="2612" w14:font="MS Gothic"/>
             <w14:uncheckedState w14:val="2610" w14:font="MS Gothic"/>
           </w14:checkbox>
@@ -611,7 +611,7 @@
             <w:rPr>
               <w:rFonts w:ascii="MS Gothic" w:eastAsia="MS Gothic" w:hAnsi="MS Gothic" w:hint="eastAsia"/>
             </w:rPr>
-            <w:t>☐</w:t>
+            <w:t>☒</w:t>
           </w:r>
         </w:sdtContent>
       </w:sdt>
@@ -2009,15 +2009,7 @@
         </w:numPr>
       </w:pPr>
       <w:r>
-        <w:t xml:space="preserve">userid - Link to </w:t>
-      </w:r>
-      <w:proofErr w:type="gramStart"/>
-      <w:r>
-        <w:t>users</w:t>
-      </w:r>
-      <w:proofErr w:type="gramEnd"/>
-      <w:r>
-        <w:t xml:space="preserve"> table</w:t>
+        <w:t>userid - Link to users table</w:t>
       </w:r>
     </w:p>
     <w:p>
@@ -2108,15 +2100,7 @@
         </w:numPr>
       </w:pPr>
       <w:r>
-        <w:t xml:space="preserve">userid - Link to </w:t>
-      </w:r>
-      <w:proofErr w:type="gramStart"/>
-      <w:r>
-        <w:t>users</w:t>
-      </w:r>
-      <w:proofErr w:type="gramEnd"/>
-      <w:r>
-        <w:t xml:space="preserve"> table</w:t>
+        <w:t>userid - Link to users table</w:t>
       </w:r>
     </w:p>
     <w:p>
@@ -3923,7 +3907,7 @@
       <w:lvlText w:val="%1."/>
       <w:lvlJc w:val="left"/>
       <w:pPr>
-        <w:ind w:left="360" w:hanging="360"/>
+        <w:ind w:left="540" w:hanging="360"/>
       </w:pPr>
       <w:rPr>
         <w:rFonts w:hint="default"/>

</xml_diff>

<commit_message>
feat: driver mobile app complete
Driver App (PWA):
- Login screen with dark theme (sky blue accent)
- Sidebar navigation with collapsible layout
- Dashboard: route summary + quick stats + trip control
- Map & Navigation: light OSM tiles + OSRM road-following route
- Stops & Students: expandable stop cards with student list
- Trip Control: start/end trip with timer + GPS tracking
- SOS/Report: 4 report types + severity + history
- GPS tracking: posts to live_locations every 5 seconds
- Turn-by-turn: auto-advance stops, ETA, distance, speed

Backend:
- driver.js: login, route/today, trips/start, trips/end
- driver.js: location/update, location/history
- driver.js: sos, sos/history
- Fixed trip_events constraint to include sos event type
- Redis graceful fallback when unavailable
- Socket.IO Redis subscriber conditional connect
</commit_message>
<xml_diff>
--- a/documantation.docx
+++ b/documantation.docx
@@ -627,7 +627,7 @@
         <w:sdtPr>
           <w:id w:val="-1000962781"/>
           <w14:checkbox>
-            <w14:checked w14:val="0"/>
+            <w14:checked w14:val="1"/>
             <w14:checkedState w14:val="2612" w14:font="MS Gothic"/>
             <w14:uncheckedState w14:val="2610" w14:font="MS Gothic"/>
           </w14:checkbox>
@@ -637,7 +637,7 @@
             <w:rPr>
               <w:rFonts w:ascii="MS Gothic" w:eastAsia="MS Gothic" w:hAnsi="MS Gothic" w:hint="eastAsia"/>
             </w:rPr>
-            <w:t>☐</w:t>
+            <w:t>☒</w:t>
           </w:r>
         </w:sdtContent>
       </w:sdt>
@@ -653,7 +653,7 @@
         <w:sdtPr>
           <w:id w:val="-259905518"/>
           <w14:checkbox>
-            <w14:checked w14:val="0"/>
+            <w14:checked w14:val="1"/>
             <w14:checkedState w14:val="2612" w14:font="MS Gothic"/>
             <w14:uncheckedState w14:val="2610" w14:font="MS Gothic"/>
           </w14:checkbox>
@@ -663,7 +663,7 @@
             <w:rPr>
               <w:rFonts w:ascii="MS Gothic" w:eastAsia="MS Gothic" w:hAnsi="MS Gothic" w:hint="eastAsia"/>
             </w:rPr>
-            <w:t>☐</w:t>
+            <w:t>☒</w:t>
           </w:r>
         </w:sdtContent>
       </w:sdt>
@@ -679,7 +679,7 @@
         <w:sdtPr>
           <w:id w:val="907648757"/>
           <w14:checkbox>
-            <w14:checked w14:val="0"/>
+            <w14:checked w14:val="1"/>
             <w14:checkedState w14:val="2612" w14:font="MS Gothic"/>
             <w14:uncheckedState w14:val="2610" w14:font="MS Gothic"/>
           </w14:checkbox>
@@ -689,7 +689,7 @@
             <w:rPr>
               <w:rFonts w:ascii="MS Gothic" w:eastAsia="MS Gothic" w:hAnsi="MS Gothic" w:hint="eastAsia"/>
             </w:rPr>
-            <w:t>☐</w:t>
+            <w:t>☒</w:t>
           </w:r>
         </w:sdtContent>
       </w:sdt>
@@ -717,7 +717,7 @@
         <w:sdtPr>
           <w:id w:val="-1235622505"/>
           <w14:checkbox>
-            <w14:checked w14:val="0"/>
+            <w14:checked w14:val="1"/>
             <w14:checkedState w14:val="2612" w14:font="MS Gothic"/>
             <w14:uncheckedState w14:val="2610" w14:font="MS Gothic"/>
           </w14:checkbox>
@@ -727,7 +727,7 @@
             <w:rPr>
               <w:rFonts w:ascii="MS Gothic" w:eastAsia="MS Gothic" w:hAnsi="MS Gothic" w:hint="eastAsia"/>
             </w:rPr>
-            <w:t>☐</w:t>
+            <w:t>☒</w:t>
           </w:r>
         </w:sdtContent>
       </w:sdt>
@@ -743,7 +743,7 @@
         <w:sdtPr>
           <w:id w:val="-1641183391"/>
           <w14:checkbox>
-            <w14:checked w14:val="0"/>
+            <w14:checked w14:val="1"/>
             <w14:checkedState w14:val="2612" w14:font="MS Gothic"/>
             <w14:uncheckedState w14:val="2610" w14:font="MS Gothic"/>
           </w14:checkbox>
@@ -753,7 +753,7 @@
             <w:rPr>
               <w:rFonts w:ascii="MS Gothic" w:eastAsia="MS Gothic" w:hAnsi="MS Gothic" w:hint="eastAsia"/>
             </w:rPr>
-            <w:t>☐</w:t>
+            <w:t>☒</w:t>
           </w:r>
         </w:sdtContent>
       </w:sdt>
@@ -769,7 +769,7 @@
         <w:sdtPr>
           <w:id w:val="-1428427445"/>
           <w14:checkbox>
-            <w14:checked w14:val="0"/>
+            <w14:checked w14:val="1"/>
             <w14:checkedState w14:val="2612" w14:font="MS Gothic"/>
             <w14:uncheckedState w14:val="2610" w14:font="MS Gothic"/>
           </w14:checkbox>
@@ -779,7 +779,7 @@
             <w:rPr>
               <w:rFonts w:ascii="MS Gothic" w:eastAsia="MS Gothic" w:hAnsi="MS Gothic" w:hint="eastAsia"/>
             </w:rPr>
-            <w:t>☐</w:t>
+            <w:t>☒</w:t>
           </w:r>
         </w:sdtContent>
       </w:sdt>
@@ -795,7 +795,7 @@
         <w:sdtPr>
           <w:id w:val="-113380126"/>
           <w14:checkbox>
-            <w14:checked w14:val="0"/>
+            <w14:checked w14:val="1"/>
             <w14:checkedState w14:val="2612" w14:font="MS Gothic"/>
             <w14:uncheckedState w14:val="2610" w14:font="MS Gothic"/>
           </w14:checkbox>
@@ -805,7 +805,7 @@
             <w:rPr>
               <w:rFonts w:ascii="MS Gothic" w:eastAsia="MS Gothic" w:hAnsi="MS Gothic" w:hint="eastAsia"/>
             </w:rPr>
-            <w:t>☐</w:t>
+            <w:t>☒</w:t>
           </w:r>
         </w:sdtContent>
       </w:sdt>
@@ -821,7 +821,7 @@
         <w:sdtPr>
           <w:id w:val="-1250801957"/>
           <w14:checkbox>
-            <w14:checked w14:val="0"/>
+            <w14:checked w14:val="1"/>
             <w14:checkedState w14:val="2612" w14:font="MS Gothic"/>
             <w14:uncheckedState w14:val="2610" w14:font="MS Gothic"/>
           </w14:checkbox>
@@ -831,7 +831,7 @@
             <w:rPr>
               <w:rFonts w:ascii="MS Gothic" w:eastAsia="MS Gothic" w:hAnsi="MS Gothic" w:hint="eastAsia"/>
             </w:rPr>
-            <w:t>☐</w:t>
+            <w:t>☒</w:t>
           </w:r>
         </w:sdtContent>
       </w:sdt>
@@ -2009,7 +2009,15 @@
         </w:numPr>
       </w:pPr>
       <w:r>
-        <w:t>userid - Link to users table</w:t>
+        <w:t xml:space="preserve">userid - Link to </w:t>
+      </w:r>
+      <w:proofErr w:type="gramStart"/>
+      <w:r>
+        <w:t>users</w:t>
+      </w:r>
+      <w:proofErr w:type="gramEnd"/>
+      <w:r>
+        <w:t xml:space="preserve"> table</w:t>
       </w:r>
     </w:p>
     <w:p>
@@ -2100,7 +2108,15 @@
         </w:numPr>
       </w:pPr>
       <w:r>
-        <w:t>userid - Link to users table</w:t>
+        <w:t xml:space="preserve">userid - Link to </w:t>
+      </w:r>
+      <w:proofErr w:type="gramStart"/>
+      <w:r>
+        <w:t>users</w:t>
+      </w:r>
+      <w:proofErr w:type="gramEnd"/>
+      <w:r>
+        <w:t xml:space="preserve"> table</w:t>
       </w:r>
     </w:p>
     <w:p>

</xml_diff>

<commit_message>
fix: bug fixes across admin, backend and student app
Admin Dashboard:
- drivers.js: fixed unassign bus from driver (COALESCE → direct null)

Backend:
- drivers.js: current_bus_id = $4 allows proper NULL assignment
- auth.js: register-student explicitly sets bus_request_status = inactive
- students.js: admin-created students set to inactive status

Student App:
- bus.js: reset selectedLat/selectedLng on request form open
- bus.js: replaced addEventListener with onclick to fix duplicate handlers
- profile.js: fixed isEditing reset + duplicate event listener bug
- index.html: updated profile tab structure
</commit_message>
<xml_diff>
--- a/documantation.docx
+++ b/documantation.docx
@@ -485,7 +485,7 @@
         <w:sdtPr>
           <w:id w:val="1869253184"/>
           <w14:checkbox>
-            <w14:checked w14:val="1"/>
+            <w14:checked w14:val="0"/>
             <w14:checkedState w14:val="2612" w14:font="MS Gothic"/>
             <w14:uncheckedState w14:val="2610" w14:font="MS Gothic"/>
           </w14:checkbox>
@@ -495,7 +495,7 @@
             <w:rPr>
               <w:rFonts w:ascii="MS Gothic" w:eastAsia="MS Gothic" w:hAnsi="MS Gothic" w:hint="eastAsia"/>
             </w:rPr>
-            <w:t>☒</w:t>
+            <w:t>☐</w:t>
           </w:r>
         </w:sdtContent>
       </w:sdt>
@@ -847,7 +847,7 @@
         <w:sdtPr>
           <w:id w:val="-1036959228"/>
           <w14:checkbox>
-            <w14:checked w14:val="0"/>
+            <w14:checked w14:val="1"/>
             <w14:checkedState w14:val="2612" w14:font="MS Gothic"/>
             <w14:uncheckedState w14:val="2610" w14:font="MS Gothic"/>
           </w14:checkbox>
@@ -857,7 +857,7 @@
             <w:rPr>
               <w:rFonts w:ascii="MS Gothic" w:eastAsia="MS Gothic" w:hAnsi="MS Gothic" w:hint="eastAsia"/>
             </w:rPr>
-            <w:t>☐</w:t>
+            <w:t>☒</w:t>
           </w:r>
         </w:sdtContent>
       </w:sdt>
@@ -873,7 +873,7 @@
         <w:sdtPr>
           <w:id w:val="1821230409"/>
           <w14:checkbox>
-            <w14:checked w14:val="0"/>
+            <w14:checked w14:val="1"/>
             <w14:checkedState w14:val="2612" w14:font="MS Gothic"/>
             <w14:uncheckedState w14:val="2610" w14:font="MS Gothic"/>
           </w14:checkbox>
@@ -883,7 +883,7 @@
             <w:rPr>
               <w:rFonts w:ascii="MS Gothic" w:eastAsia="MS Gothic" w:hAnsi="MS Gothic" w:hint="eastAsia"/>
             </w:rPr>
-            <w:t>☐</w:t>
+            <w:t>☒</w:t>
           </w:r>
         </w:sdtContent>
       </w:sdt>
@@ -900,7 +900,7 @@
         </w:numPr>
       </w:pPr>
       <w:r>
-        <w:t>Parent/Student Mobile App</w:t>
+        <w:t>Student Mobile App</w:t>
       </w:r>
     </w:p>
     <w:p>
@@ -911,7 +911,7 @@
         <w:sdtPr>
           <w:id w:val="314075087"/>
           <w14:checkbox>
-            <w14:checked w14:val="0"/>
+            <w14:checked w14:val="1"/>
             <w14:checkedState w14:val="2612" w14:font="MS Gothic"/>
             <w14:uncheckedState w14:val="2610" w14:font="MS Gothic"/>
           </w14:checkbox>
@@ -921,7 +921,7 @@
             <w:rPr>
               <w:rFonts w:ascii="MS Gothic" w:eastAsia="MS Gothic" w:hAnsi="MS Gothic" w:hint="eastAsia"/>
             </w:rPr>
-            <w:t>☐</w:t>
+            <w:t>☒</w:t>
           </w:r>
         </w:sdtContent>
       </w:sdt>
@@ -937,7 +937,7 @@
         <w:sdtPr>
           <w:id w:val="-1751804381"/>
           <w14:checkbox>
-            <w14:checked w14:val="0"/>
+            <w14:checked w14:val="1"/>
             <w14:checkedState w14:val="2612" w14:font="MS Gothic"/>
             <w14:uncheckedState w14:val="2610" w14:font="MS Gothic"/>
           </w14:checkbox>
@@ -947,7 +947,7 @@
             <w:rPr>
               <w:rFonts w:ascii="MS Gothic" w:eastAsia="MS Gothic" w:hAnsi="MS Gothic" w:hint="eastAsia"/>
             </w:rPr>
-            <w:t>☐</w:t>
+            <w:t>☒</w:t>
           </w:r>
         </w:sdtContent>
       </w:sdt>
@@ -963,7 +963,7 @@
         <w:sdtPr>
           <w:id w:val="2015955923"/>
           <w14:checkbox>
-            <w14:checked w14:val="0"/>
+            <w14:checked w14:val="1"/>
             <w14:checkedState w14:val="2612" w14:font="MS Gothic"/>
             <w14:uncheckedState w14:val="2610" w14:font="MS Gothic"/>
           </w14:checkbox>
@@ -973,7 +973,7 @@
             <w:rPr>
               <w:rFonts w:ascii="MS Gothic" w:eastAsia="MS Gothic" w:hAnsi="MS Gothic" w:hint="eastAsia"/>
             </w:rPr>
-            <w:t>☐</w:t>
+            <w:t>☒</w:t>
           </w:r>
         </w:sdtContent>
       </w:sdt>
@@ -989,7 +989,7 @@
         <w:sdtPr>
           <w:id w:val="-2116196911"/>
           <w14:checkbox>
-            <w14:checked w14:val="0"/>
+            <w14:checked w14:val="1"/>
             <w14:checkedState w14:val="2612" w14:font="MS Gothic"/>
             <w14:uncheckedState w14:val="2610" w14:font="MS Gothic"/>
           </w14:checkbox>
@@ -999,7 +999,7 @@
             <w:rPr>
               <w:rFonts w:ascii="MS Gothic" w:eastAsia="MS Gothic" w:hAnsi="MS Gothic" w:hint="eastAsia"/>
             </w:rPr>
-            <w:t>☐</w:t>
+            <w:t>☒</w:t>
           </w:r>
         </w:sdtContent>
       </w:sdt>
@@ -1015,7 +1015,7 @@
         <w:sdtPr>
           <w:id w:val="-608272431"/>
           <w14:checkbox>
-            <w14:checked w14:val="0"/>
+            <w14:checked w14:val="1"/>
             <w14:checkedState w14:val="2612" w14:font="MS Gothic"/>
             <w14:uncheckedState w14:val="2610" w14:font="MS Gothic"/>
           </w14:checkbox>
@@ -1025,7 +1025,7 @@
             <w:rPr>
               <w:rFonts w:ascii="MS Gothic" w:eastAsia="MS Gothic" w:hAnsi="MS Gothic" w:hint="eastAsia"/>
             </w:rPr>
-            <w:t>☐</w:t>
+            <w:t>☒</w:t>
           </w:r>
         </w:sdtContent>
       </w:sdt>
@@ -1041,7 +1041,7 @@
         <w:sdtPr>
           <w:id w:val="1576852843"/>
           <w14:checkbox>
-            <w14:checked w14:val="0"/>
+            <w14:checked w14:val="1"/>
             <w14:checkedState w14:val="2612" w14:font="MS Gothic"/>
             <w14:uncheckedState w14:val="2610" w14:font="MS Gothic"/>
           </w14:checkbox>
@@ -1051,7 +1051,7 @@
             <w:rPr>
               <w:rFonts w:ascii="MS Gothic" w:eastAsia="MS Gothic" w:hAnsi="MS Gothic" w:hint="eastAsia"/>
             </w:rPr>
-            <w:t>☐</w:t>
+            <w:t>☒</w:t>
           </w:r>
         </w:sdtContent>
       </w:sdt>

</xml_diff>